<commit_message>
feat: replace jobkorea resume template mapping
</commit_message>
<xml_diff>
--- a/jobpilot-ai/backend/src/main/resources/resume-templates/jobkorea.docx
+++ b/jobpilot-ai/backend/src/main/resources/resume-templates/jobkorea.docx
@@ -172,14 +172,6 @@
                 <w:szCs w:val="16"/>
               </w:rPr>
             </w:pPr>
-            <w:r>
-              <w:rPr>
-                <w:rFonts w:ascii="맑은 고딕" w:eastAsia="맑은 고딕" w:hAnsi="맑은 고딕" w:hint="eastAsia"/>
-                <w:sz w:val="16"/>
-                <w:szCs w:val="16"/>
-              </w:rPr>
-              <w:t>홍길동</w:t>
-            </w:r>
           </w:p>
         </w:tc>
         <w:tc>
@@ -243,14 +235,6 @@
                 <w:szCs w:val="16"/>
               </w:rPr>
             </w:pPr>
-            <w:r>
-              <w:rPr>
-                <w:rFonts w:ascii="맑은 고딕" w:eastAsia="맑은 고딕" w:hAnsi="맑은 고딕" w:hint="eastAsia"/>
-                <w:sz w:val="16"/>
-                <w:szCs w:val="16"/>
-              </w:rPr>
-              <w:t>Name</w:t>
-            </w:r>
           </w:p>
         </w:tc>
         <w:tc>
@@ -315,46 +299,6 @@
                 <w:szCs w:val="16"/>
               </w:rPr>
             </w:pPr>
-            <w:r>
-              <w:rPr>
-                <w:rFonts w:ascii="바탕" w:eastAsia="바탕" w:hAnsi="바탕" w:cs="바탕" w:hint="eastAsia"/>
-                <w:sz w:val="16"/>
-                <w:szCs w:val="16"/>
-              </w:rPr>
-              <w:t>女</w:t>
-            </w:r>
-            <w:r>
-              <w:rPr>
-                <w:rFonts w:ascii="맑은 고딕" w:eastAsia="맑은 고딕" w:hAnsi="맑은 고딕" w:hint="eastAsia"/>
-                <w:sz w:val="16"/>
-                <w:szCs w:val="16"/>
-              </w:rPr>
-              <w:t>,</w:t>
-            </w:r>
-            <w:r>
-              <w:rPr>
-                <w:rFonts w:ascii="맑은 고딕" w:eastAsia="맑은 고딕" w:hAnsi="맑은 고딕"/>
-                <w:sz w:val="16"/>
-                <w:szCs w:val="16"/>
-              </w:rPr>
-              <w:t>198</w:t>
-            </w:r>
-            <w:r>
-              <w:rPr>
-                <w:rFonts w:ascii="맑은 고딕" w:eastAsia="맑은 고딕" w:hAnsi="맑은 고딕" w:hint="eastAsia"/>
-                <w:sz w:val="16"/>
-                <w:szCs w:val="16"/>
-              </w:rPr>
-              <w:t>6</w:t>
-            </w:r>
-            <w:r>
-              <w:rPr>
-                <w:rFonts w:ascii="맑은 고딕" w:eastAsia="맑은 고딕" w:hAnsi="맑은 고딕"/>
-                <w:sz w:val="16"/>
-                <w:szCs w:val="16"/>
-              </w:rPr>
-              <w:t>년생</w:t>
-            </w:r>
           </w:p>
         </w:tc>
       </w:tr>
@@ -498,14 +442,6 @@
                 <w:szCs w:val="16"/>
               </w:rPr>
             </w:pPr>
-            <w:r>
-              <w:rPr>
-                <w:rFonts w:ascii="맑은 고딕" w:eastAsia="맑은 고딕" w:hAnsi="맑은 고딕" w:hint="eastAsia"/>
-                <w:sz w:val="16"/>
-                <w:szCs w:val="16"/>
-              </w:rPr>
-              <w:t>웹서비스 기획, 모바일 기획</w:t>
-            </w:r>
           </w:p>
         </w:tc>
         <w:tc>
@@ -567,14 +503,6 @@
                 <w:szCs w:val="16"/>
               </w:rPr>
             </w:pPr>
-            <w:r>
-              <w:rPr>
-                <w:rFonts w:ascii="맑은 고딕" w:eastAsia="맑은 고딕" w:hAnsi="맑은 고딕" w:hint="eastAsia"/>
-                <w:sz w:val="16"/>
-                <w:szCs w:val="16"/>
-              </w:rPr>
-              <w:t>5년 6개월</w:t>
-            </w:r>
           </w:p>
         </w:tc>
       </w:tr>
@@ -719,38 +647,6 @@
                 <w:szCs w:val="16"/>
               </w:rPr>
             </w:pPr>
-            <w:r>
-              <w:rPr>
-                <w:rFonts w:ascii="맑은 고딕" w:eastAsia="맑은 고딕" w:hAnsi="맑은 고딕" w:hint="eastAsia"/>
-                <w:sz w:val="16"/>
-                <w:szCs w:val="16"/>
-              </w:rPr>
-              <w:t>010-</w:t>
-            </w:r>
-            <w:r>
-              <w:rPr>
-                <w:rFonts w:ascii="맑은 고딕" w:eastAsia="맑은 고딕" w:hAnsi="맑은 고딕" w:hint="eastAsia"/>
-                <w:sz w:val="16"/>
-                <w:szCs w:val="16"/>
-              </w:rPr>
-              <w:t>0000</w:t>
-            </w:r>
-            <w:r>
-              <w:rPr>
-                <w:rFonts w:ascii="맑은 고딕" w:eastAsia="맑은 고딕" w:hAnsi="맑은 고딕" w:hint="eastAsia"/>
-                <w:sz w:val="16"/>
-                <w:szCs w:val="16"/>
-              </w:rPr>
-              <w:t>-</w:t>
-            </w:r>
-            <w:r>
-              <w:rPr>
-                <w:rFonts w:ascii="맑은 고딕" w:eastAsia="맑은 고딕" w:hAnsi="맑은 고딕" w:hint="eastAsia"/>
-                <w:sz w:val="16"/>
-                <w:szCs w:val="16"/>
-              </w:rPr>
-              <w:t>0000</w:t>
-            </w:r>
           </w:p>
         </w:tc>
         <w:tc>
@@ -813,25 +709,6 @@
                 <w:szCs w:val="16"/>
               </w:rPr>
             </w:pPr>
-            <w:hyperlink r:id="rId8" w:history="1">
-              <w:r>
-                <w:rPr>
-                  <w:rStyle w:val="a7"/>
-                  <w:sz w:val="16"/>
-                  <w:szCs w:val="16"/>
-                </w:rPr>
-                <w:t>http://jobkorea.</w:t>
-              </w:r>
-              <w:r>
-                <w:rPr>
-                  <w:rStyle w:val="a7"/>
-                  <w:rFonts w:hint="eastAsia"/>
-                  <w:sz w:val="16"/>
-                  <w:szCs w:val="16"/>
-                </w:rPr>
-                <w:t>co.kr</w:t>
-              </w:r>
-            </w:hyperlink>
           </w:p>
         </w:tc>
       </w:tr>
@@ -975,30 +852,6 @@
                 <w:szCs w:val="16"/>
               </w:rPr>
             </w:pPr>
-            <w:r>
-              <w:rPr>
-                <w:rFonts w:ascii="맑은 고딕" w:eastAsia="맑은 고딕" w:hAnsi="맑은 고딕" w:hint="eastAsia"/>
-                <w:sz w:val="16"/>
-                <w:szCs w:val="16"/>
-              </w:rPr>
-              <w:t>jobkorea</w:t>
-            </w:r>
-            <w:r>
-              <w:rPr>
-                <w:rFonts w:ascii="맑은 고딕" w:eastAsia="맑은 고딕" w:hAnsi="맑은 고딕" w:hint="eastAsia"/>
-                <w:sz w:val="16"/>
-                <w:szCs w:val="16"/>
-              </w:rPr>
-              <w:t>@</w:t>
-            </w:r>
-            <w:r>
-              <w:rPr>
-                <w:rFonts w:ascii="맑은 고딕" w:eastAsia="맑은 고딕" w:hAnsi="맑은 고딕" w:hint="eastAsia"/>
-                <w:sz w:val="16"/>
-                <w:szCs w:val="16"/>
-              </w:rPr>
-              <w:t>jobkorea.co.kr</w:t>
-            </w:r>
           </w:p>
         </w:tc>
       </w:tr>
@@ -1142,32 +995,6 @@
                 <w:szCs w:val="16"/>
               </w:rPr>
             </w:pPr>
-            <w:r>
-              <w:rPr>
-                <w:rFonts w:ascii="맑은 고딕" w:eastAsia="맑은 고딕" w:hAnsi="맑은 고딕" w:hint="eastAsia"/>
-                <w:sz w:val="16"/>
-                <w:szCs w:val="16"/>
-              </w:rPr>
-              <w:t>1588-9350</w:t>
-            </w:r>
-            <w:r>
-              <w:rPr>
-                <w:rFonts w:ascii="맑은 고딕" w:eastAsia="맑은 고딕" w:hAnsi="맑은 고딕" w:hint="eastAsia"/>
-                <w:sz w:val="16"/>
-                <w:szCs w:val="16"/>
-              </w:rPr>
-              <w:t xml:space="preserve"> </w:t>
-            </w:r>
-            <w:hyperlink r:id="rId9" w:history="1">
-              <w:r>
-                <w:rPr>
-                  <w:rFonts w:ascii="맑은 고딕" w:eastAsia="맑은 고딕" w:hAnsi="맑은 고딕" w:hint="eastAsia"/>
-                  <w:sz w:val="16"/>
-                  <w:szCs w:val="16"/>
-                </w:rPr>
-                <w:t>서울특별시 서초구 서초대로 301 동익성봉빌딩 16~18층</w:t>
-              </w:r>
-            </w:hyperlink>
           </w:p>
         </w:tc>
       </w:tr>
@@ -1237,34 +1064,8 @@
       <w:r>
         <w:rPr>
           <w:rFonts w:ascii="맑은 고딕" w:eastAsia="맑은 고딕" w:hAnsi="맑은 고딕" w:hint="eastAsia"/>
-          <w:b w:val="0"/>
         </w:rPr>
-        <w:t xml:space="preserve"> </w:t>
-      </w:r>
-      <w:r>
-        <w:rPr>
-          <w:rFonts w:ascii="맑은 고딕" w:eastAsia="맑은 고딕" w:hAnsi="맑은 고딕" w:hint="eastAsia"/>
-        </w:rPr>
-        <w:t>좋은</w:t>
-      </w:r>
-      <w:r>
-        <w:rPr>
-          <w:rFonts w:ascii="맑은 고딕" w:eastAsia="맑은 고딕" w:hAnsi="맑은 고딕" w:hint="eastAsia"/>
-        </w:rPr>
-        <w:t>대학교</w:t>
-      </w:r>
-      <w:r>
-        <w:rPr>
-          <w:rFonts w:ascii="맑은 고딕" w:eastAsia="맑은 고딕" w:hAnsi="맑은 고딕" w:hint="eastAsia"/>
-        </w:rPr>
-        <w:t xml:space="preserve">(4년) </w:t>
-      </w:r>
-      <w:r>
-        <w:rPr>
-          <w:rStyle w:val="8Char"/>
-          <w:rFonts w:ascii="맑은 고딕" w:eastAsia="맑은 고딕" w:hAnsi="맑은 고딕" w:hint="eastAsia"/>
-        </w:rPr>
-        <w:t>졸업</w:t>
+        <w:t xml:space="preserve">       </w:t>
       </w:r>
       <w:r>
         <w:rPr>
@@ -1470,46 +1271,6 @@
                 <w:szCs w:val="16"/>
               </w:rPr>
             </w:pPr>
-            <w:r>
-              <w:rPr>
-                <w:rFonts w:ascii="맑은 고딕" w:eastAsia="맑은 고딕" w:hAnsi="맑은 고딕" w:hint="eastAsia"/>
-                <w:sz w:val="16"/>
-                <w:szCs w:val="16"/>
-              </w:rPr>
-              <w:t>200</w:t>
-            </w:r>
-            <w:r>
-              <w:rPr>
-                <w:rFonts w:ascii="맑은 고딕" w:eastAsia="맑은 고딕" w:hAnsi="맑은 고딕" w:hint="eastAsia"/>
-                <w:sz w:val="16"/>
-                <w:szCs w:val="16"/>
-              </w:rPr>
-              <w:t>2</w:t>
-            </w:r>
-            <w:r>
-              <w:rPr>
-                <w:rFonts w:ascii="맑은 고딕" w:eastAsia="맑은 고딕" w:hAnsi="맑은 고딕" w:hint="eastAsia"/>
-                <w:sz w:val="16"/>
-                <w:szCs w:val="16"/>
-              </w:rPr>
-              <w:t>. 03 ~ 20</w:t>
-            </w:r>
-            <w:r>
-              <w:rPr>
-                <w:rFonts w:ascii="맑은 고딕" w:eastAsia="맑은 고딕" w:hAnsi="맑은 고딕" w:hint="eastAsia"/>
-                <w:sz w:val="16"/>
-                <w:szCs w:val="16"/>
-              </w:rPr>
-              <w:t>05</w:t>
-            </w:r>
-            <w:r>
-              <w:rPr>
-                <w:rFonts w:ascii="맑은 고딕" w:eastAsia="맑은 고딕" w:hAnsi="맑은 고딕" w:hint="eastAsia"/>
-                <w:sz w:val="16"/>
-                <w:szCs w:val="16"/>
-              </w:rPr>
-              <w:t>. 03</w:t>
-            </w:r>
           </w:p>
         </w:tc>
         <w:tc>
@@ -1538,22 +1299,6 @@
                 <w:szCs w:val="16"/>
               </w:rPr>
             </w:pPr>
-            <w:r>
-              <w:rPr>
-                <w:rFonts w:ascii="맑은 고딕" w:eastAsia="맑은 고딕" w:hAnsi="맑은 고딕" w:hint="eastAsia"/>
-                <w:sz w:val="16"/>
-                <w:szCs w:val="16"/>
-              </w:rPr>
-              <w:t>OO</w:t>
-            </w:r>
-            <w:r>
-              <w:rPr>
-                <w:rFonts w:ascii="맑은 고딕" w:eastAsia="맑은 고딕" w:hAnsi="맑은 고딕" w:hint="eastAsia"/>
-                <w:sz w:val="16"/>
-                <w:szCs w:val="16"/>
-              </w:rPr>
-              <w:t>여자고등학교</w:t>
-            </w:r>
           </w:p>
         </w:tc>
         <w:tc>
@@ -1580,24 +1325,6 @@
                 <w:rFonts w:ascii="맑은 고딕" w:eastAsia="맑은 고딕" w:hAnsi="맑은 고딕"/>
               </w:rPr>
             </w:pPr>
-            <w:r>
-              <w:rPr>
-                <w:rFonts w:ascii="맑은 고딕" w:eastAsia="맑은 고딕" w:hAnsi="맑은 고딕" w:hint="eastAsia"/>
-              </w:rPr>
-              <w:t xml:space="preserve">3.8 </w:t>
-            </w:r>
-            <w:r>
-              <w:rPr>
-                <w:rFonts w:ascii="맑은 고딕" w:eastAsia="맑은 고딕" w:hAnsi="맑은 고딕" w:hint="eastAsia"/>
-              </w:rPr>
-              <w:t>/</w:t>
-            </w:r>
-            <w:r>
-              <w:rPr>
-                <w:rFonts w:ascii="맑은 고딕" w:eastAsia="맑은 고딕" w:hAnsi="맑은 고딕" w:hint="eastAsia"/>
-              </w:rPr>
-              <w:t xml:space="preserve"> 4.0</w:t>
-            </w:r>
           </w:p>
         </w:tc>
         <w:tc>
@@ -1623,12 +1350,6 @@
                 <w:rFonts w:ascii="맑은 고딕" w:eastAsia="맑은 고딕" w:hAnsi="맑은 고딕"/>
               </w:rPr>
             </w:pPr>
-            <w:r>
-              <w:rPr>
-                <w:rFonts w:ascii="맑은 고딕" w:eastAsia="맑은 고딕" w:hAnsi="맑은 고딕" w:hint="eastAsia"/>
-              </w:rPr>
-              <w:t>강원</w:t>
-            </w:r>
           </w:p>
         </w:tc>
       </w:tr>
@@ -1658,14 +1379,6 @@
                 <w:szCs w:val="16"/>
               </w:rPr>
             </w:pPr>
-            <w:r>
-              <w:rPr>
-                <w:rFonts w:ascii="맑은 고딕" w:eastAsia="맑은 고딕" w:hAnsi="맑은 고딕" w:hint="eastAsia"/>
-                <w:sz w:val="16"/>
-                <w:szCs w:val="16"/>
-              </w:rPr>
-              <w:t>2005. 03 ~ 2010. 03</w:t>
-            </w:r>
           </w:p>
         </w:tc>
         <w:tc>
@@ -1694,54 +1407,6 @@
                 <w:szCs w:val="16"/>
               </w:rPr>
             </w:pPr>
-            <w:r>
-              <w:rPr>
-                <w:rFonts w:ascii="맑은 고딕" w:eastAsia="맑은 고딕" w:hAnsi="맑은 고딕" w:hint="eastAsia"/>
-                <w:sz w:val="16"/>
-                <w:szCs w:val="16"/>
-              </w:rPr>
-              <w:t>OO</w:t>
-            </w:r>
-            <w:r>
-              <w:rPr>
-                <w:rFonts w:ascii="맑은 고딕" w:eastAsia="맑은 고딕" w:hAnsi="맑은 고딕" w:hint="eastAsia"/>
-                <w:sz w:val="16"/>
-                <w:szCs w:val="16"/>
-              </w:rPr>
-              <w:t>대학교</w:t>
-            </w:r>
-            <w:r>
-              <w:rPr>
-                <w:rFonts w:ascii="맑은 고딕" w:eastAsia="맑은 고딕" w:hAnsi="맑은 고딕"/>
-                <w:sz w:val="16"/>
-                <w:szCs w:val="16"/>
-              </w:rPr>
-              <w:t xml:space="preserve"> </w:t>
-            </w:r>
-            <w:r>
-              <w:rPr>
-                <w:rFonts w:ascii="맑은 고딕" w:eastAsia="맑은 고딕" w:hAnsi="맑은 고딕" w:hint="eastAsia"/>
-                <w:sz w:val="16"/>
-                <w:szCs w:val="16"/>
-              </w:rPr>
-              <w:t>서울</w:t>
-            </w:r>
-            <w:r>
-              <w:rPr>
-                <w:rFonts w:ascii="맑은 고딕" w:eastAsia="맑은 고딕" w:hAnsi="맑은 고딕"/>
-                <w:sz w:val="16"/>
-                <w:szCs w:val="16"/>
-              </w:rPr>
-              <w:t>캠퍼스</w:t>
-            </w:r>
-            <w:r>
-              <w:rPr>
-                <w:rFonts w:ascii="맑은 고딕" w:eastAsia="맑은 고딕" w:hAnsi="맑은 고딕" w:hint="eastAsia"/>
-                <w:sz w:val="16"/>
-                <w:szCs w:val="16"/>
-              </w:rPr>
-              <w:t xml:space="preserve"> 경영학과</w:t>
-            </w:r>
           </w:p>
         </w:tc>
         <w:tc>
@@ -1768,24 +1433,6 @@
                 <w:rFonts w:ascii="맑은 고딕" w:eastAsia="맑은 고딕" w:hAnsi="맑은 고딕"/>
               </w:rPr>
             </w:pPr>
-            <w:r>
-              <w:rPr>
-                <w:rFonts w:ascii="맑은 고딕" w:eastAsia="맑은 고딕" w:hAnsi="맑은 고딕" w:hint="eastAsia"/>
-              </w:rPr>
-              <w:t xml:space="preserve">3.8 </w:t>
-            </w:r>
-            <w:r>
-              <w:rPr>
-                <w:rFonts w:ascii="맑은 고딕" w:eastAsia="맑은 고딕" w:hAnsi="맑은 고딕" w:hint="eastAsia"/>
-              </w:rPr>
-              <w:t>/</w:t>
-            </w:r>
-            <w:r>
-              <w:rPr>
-                <w:rFonts w:ascii="맑은 고딕" w:eastAsia="맑은 고딕" w:hAnsi="맑은 고딕" w:hint="eastAsia"/>
-              </w:rPr>
-              <w:t xml:space="preserve"> 4.5</w:t>
-            </w:r>
           </w:p>
         </w:tc>
         <w:tc>
@@ -1811,12 +1458,6 @@
                 <w:rFonts w:ascii="맑은 고딕" w:eastAsia="맑은 고딕" w:hAnsi="맑은 고딕"/>
               </w:rPr>
             </w:pPr>
-            <w:r>
-              <w:rPr>
-                <w:rFonts w:ascii="맑은 고딕" w:eastAsia="맑은 고딕" w:hAnsi="맑은 고딕" w:hint="eastAsia"/>
-              </w:rPr>
-              <w:t>서울</w:t>
-            </w:r>
           </w:p>
         </w:tc>
       </w:tr>
@@ -1889,28 +1530,14 @@
           <w:rFonts w:ascii="맑은 고딕" w:eastAsia="맑은 고딕" w:hAnsi="맑은 고딕" w:hint="eastAsia"/>
           <w:b w:val="0"/>
         </w:rPr>
-        <w:t xml:space="preserve">경력: </w:t>
+        <w:t>경력:</w:t>
       </w:r>
       <w:r>
         <w:rPr>
           <w:rStyle w:val="8Char"/>
           <w:rFonts w:ascii="맑은 고딕" w:eastAsia="맑은 고딕" w:hAnsi="맑은 고딕" w:hint="eastAsia"/>
         </w:rPr>
-        <w:t>5</w:t>
-      </w:r>
-      <w:r>
-        <w:rPr>
-          <w:rStyle w:val="8Char"/>
-          <w:rFonts w:ascii="맑은 고딕" w:eastAsia="맑은 고딕" w:hAnsi="맑은 고딕" w:hint="eastAsia"/>
-        </w:rPr>
-        <w:t>년</w:t>
-      </w:r>
-      <w:r>
-        <w:rPr>
-          <w:rStyle w:val="8Char"/>
-          <w:rFonts w:ascii="맑은 고딕" w:eastAsia="맑은 고딕" w:hAnsi="맑은 고딕" w:hint="eastAsia"/>
-        </w:rPr>
-        <w:t xml:space="preserve"> 6개월</w:t>
+        <w:t xml:space="preserve">        </w:t>
       </w:r>
       <w:r>
         <w:rPr>
@@ -2148,14 +1775,6 @@
                 <w:szCs w:val="16"/>
               </w:rPr>
             </w:pPr>
-            <w:r>
-              <w:rPr>
-                <w:rFonts w:ascii="맑은 고딕" w:eastAsia="맑은 고딕" w:hAnsi="맑은 고딕" w:hint="eastAsia"/>
-                <w:sz w:val="16"/>
-                <w:szCs w:val="16"/>
-              </w:rPr>
-              <w:t>2015. 02 ~ 재직중</w:t>
-            </w:r>
           </w:p>
         </w:tc>
         <w:tc>
@@ -2184,22 +1803,6 @@
                 <w:szCs w:val="16"/>
               </w:rPr>
             </w:pPr>
-            <w:r>
-              <w:rPr>
-                <w:rFonts w:ascii="맑은 고딕" w:eastAsia="맑은 고딕" w:hAnsi="맑은 고딕"/>
-                <w:sz w:val="16"/>
-                <w:szCs w:val="16"/>
-              </w:rPr>
-              <w:t>㈜</w:t>
-            </w:r>
-            <w:r>
-              <w:rPr>
-                <w:rFonts w:ascii="맑은 고딕" w:eastAsia="맑은 고딕" w:hAnsi="맑은 고딕" w:hint="eastAsia"/>
-                <w:sz w:val="16"/>
-                <w:szCs w:val="16"/>
-              </w:rPr>
-              <w:t>잡코리아</w:t>
-            </w:r>
           </w:p>
         </w:tc>
         <w:tc>
@@ -2224,14 +1827,6 @@
                 <w:szCs w:val="16"/>
               </w:rPr>
             </w:pPr>
-            <w:r>
-              <w:rPr>
-                <w:rFonts w:ascii="맑은 고딕" w:eastAsia="맑은 고딕" w:hAnsi="맑은 고딕" w:hint="eastAsia"/>
-                <w:sz w:val="16"/>
-                <w:szCs w:val="16"/>
-              </w:rPr>
-              <w:t>기획</w:t>
-            </w:r>
           </w:p>
         </w:tc>
         <w:tc>
@@ -2258,12 +1853,6 @@
                 <w:rFonts w:ascii="맑은 고딕" w:eastAsia="맑은 고딕" w:hAnsi="맑은 고딕"/>
               </w:rPr>
             </w:pPr>
-            <w:r>
-              <w:rPr>
-                <w:rFonts w:ascii="맑은 고딕" w:eastAsia="맑은 고딕" w:hAnsi="맑은 고딕" w:hint="eastAsia"/>
-              </w:rPr>
-              <w:t>대리</w:t>
-            </w:r>
           </w:p>
         </w:tc>
         <w:tc>
@@ -2289,18 +1878,6 @@
                 <w:rFonts w:ascii="맑은 고딕" w:eastAsia="맑은 고딕" w:hAnsi="맑은 고딕"/>
               </w:rPr>
             </w:pPr>
-            <w:r>
-              <w:rPr>
-                <w:rFonts w:ascii="맑은 고딕" w:eastAsia="맑은 고딕" w:hAnsi="맑은 고딕"/>
-              </w:rPr>
-              <w:t>웹서비스기획, 모바일기획</w:t>
-            </w:r>
-            <w:r>
-              <w:rPr>
-                <w:rFonts w:ascii="맑은 고딕" w:eastAsia="맑은 고딕" w:hAnsi="맑은 고딕" w:hint="eastAsia"/>
-              </w:rPr>
-              <w:t>, ui설계</w:t>
-            </w:r>
           </w:p>
         </w:tc>
       </w:tr>
@@ -2330,14 +1907,6 @@
                 <w:szCs w:val="16"/>
               </w:rPr>
             </w:pPr>
-            <w:r>
-              <w:rPr>
-                <w:rFonts w:ascii="맑은 고딕" w:eastAsia="맑은 고딕" w:hAnsi="맑은 고딕" w:hint="eastAsia"/>
-                <w:sz w:val="16"/>
-                <w:szCs w:val="16"/>
-              </w:rPr>
-              <w:t>2013. 02 ~ 2015. 02</w:t>
-            </w:r>
           </w:p>
         </w:tc>
         <w:tc>
@@ -2366,14 +1935,6 @@
                 <w:szCs w:val="16"/>
               </w:rPr>
             </w:pPr>
-            <w:r>
-              <w:rPr>
-                <w:rFonts w:ascii="맑은 고딕" w:eastAsia="맑은 고딕" w:hAnsi="맑은 고딕" w:hint="eastAsia"/>
-                <w:sz w:val="16"/>
-                <w:szCs w:val="16"/>
-              </w:rPr>
-              <w:t>알바몬</w:t>
-            </w:r>
           </w:p>
         </w:tc>
         <w:tc>
@@ -2398,14 +1959,6 @@
                 <w:szCs w:val="16"/>
               </w:rPr>
             </w:pPr>
-            <w:r>
-              <w:rPr>
-                <w:rFonts w:ascii="맑은 고딕" w:eastAsia="맑은 고딕" w:hAnsi="맑은 고딕" w:hint="eastAsia"/>
-                <w:sz w:val="16"/>
-                <w:szCs w:val="16"/>
-              </w:rPr>
-              <w:t>기획</w:t>
-            </w:r>
           </w:p>
         </w:tc>
         <w:tc>
@@ -2432,12 +1985,6 @@
                 <w:rFonts w:ascii="맑은 고딕" w:eastAsia="맑은 고딕" w:hAnsi="맑은 고딕"/>
               </w:rPr>
             </w:pPr>
-            <w:r>
-              <w:rPr>
-                <w:rFonts w:ascii="맑은 고딕" w:eastAsia="맑은 고딕" w:hAnsi="맑은 고딕" w:hint="eastAsia"/>
-              </w:rPr>
-              <w:t>주임</w:t>
-            </w:r>
           </w:p>
         </w:tc>
         <w:tc>
@@ -2463,18 +2010,6 @@
                 <w:rFonts w:ascii="맑은 고딕" w:eastAsia="맑은 고딕" w:hAnsi="맑은 고딕"/>
               </w:rPr>
             </w:pPr>
-            <w:r>
-              <w:rPr>
-                <w:rFonts w:ascii="맑은 고딕" w:eastAsia="맑은 고딕" w:hAnsi="맑은 고딕"/>
-              </w:rPr>
-              <w:t>웹서비스기획, 모바일기획</w:t>
-            </w:r>
-            <w:r>
-              <w:rPr>
-                <w:rFonts w:ascii="맑은 고딕" w:eastAsia="맑은 고딕" w:hAnsi="맑은 고딕" w:hint="eastAsia"/>
-              </w:rPr>
-              <w:t>, ui설계</w:t>
-            </w:r>
           </w:p>
         </w:tc>
       </w:tr>
@@ -2718,14 +2253,6 @@
                 <w:szCs w:val="16"/>
               </w:rPr>
             </w:pPr>
-            <w:r>
-              <w:rPr>
-                <w:rFonts w:ascii="맑은 고딕" w:eastAsia="맑은 고딕" w:hAnsi="맑은 고딕" w:hint="eastAsia"/>
-                <w:sz w:val="16"/>
-                <w:szCs w:val="16"/>
-              </w:rPr>
-              <w:t>2015. 02 취득</w:t>
-            </w:r>
           </w:p>
         </w:tc>
         <w:tc>
@@ -2754,14 +2281,6 @@
                 <w:szCs w:val="16"/>
               </w:rPr>
             </w:pPr>
-            <w:r>
-              <w:rPr>
-                <w:rFonts w:ascii="맑은 고딕" w:eastAsia="맑은 고딕" w:hAnsi="맑은 고딕" w:hint="eastAsia"/>
-                <w:sz w:val="16"/>
-                <w:szCs w:val="16"/>
-              </w:rPr>
-              <w:t>JLPT</w:t>
-            </w:r>
           </w:p>
         </w:tc>
         <w:tc>
@@ -2786,14 +2305,6 @@
                 <w:szCs w:val="16"/>
               </w:rPr>
             </w:pPr>
-            <w:r>
-              <w:rPr>
-                <w:rFonts w:ascii="맑은 고딕" w:eastAsia="맑은 고딕" w:hAnsi="맑은 고딕" w:hint="eastAsia"/>
-                <w:sz w:val="16"/>
-                <w:szCs w:val="16"/>
-              </w:rPr>
-              <w:t>000점</w:t>
-            </w:r>
           </w:p>
         </w:tc>
         <w:tc>
@@ -2819,12 +2330,6 @@
                 <w:rFonts w:ascii="맑은 고딕" w:eastAsia="맑은 고딕" w:hAnsi="맑은 고딕"/>
               </w:rPr>
             </w:pPr>
-            <w:r>
-              <w:rPr>
-                <w:rFonts w:ascii="맑은 고딕" w:eastAsia="맑은 고딕" w:hAnsi="맑은 고딕"/>
-              </w:rPr>
-              <w:t>OOO 어학시험</w:t>
-            </w:r>
           </w:p>
         </w:tc>
       </w:tr>
@@ -2854,14 +2359,6 @@
                 <w:szCs w:val="16"/>
               </w:rPr>
             </w:pPr>
-            <w:r>
-              <w:rPr>
-                <w:rFonts w:ascii="맑은 고딕" w:eastAsia="맑은 고딕" w:hAnsi="맑은 고딕" w:hint="eastAsia"/>
-                <w:sz w:val="16"/>
-                <w:szCs w:val="16"/>
-              </w:rPr>
-              <w:t>2015. 02 취득</w:t>
-            </w:r>
           </w:p>
         </w:tc>
         <w:tc>
@@ -2890,14 +2387,6 @@
                 <w:szCs w:val="16"/>
               </w:rPr>
             </w:pPr>
-            <w:r>
-              <w:rPr>
-                <w:rFonts w:ascii="맑은 고딕" w:eastAsia="맑은 고딕" w:hAnsi="맑은 고딕" w:hint="eastAsia"/>
-                <w:sz w:val="16"/>
-                <w:szCs w:val="16"/>
-              </w:rPr>
-              <w:t>TOEIC</w:t>
-            </w:r>
           </w:p>
         </w:tc>
         <w:tc>
@@ -2922,14 +2411,6 @@
                 <w:szCs w:val="16"/>
               </w:rPr>
             </w:pPr>
-            <w:r>
-              <w:rPr>
-                <w:rFonts w:ascii="맑은 고딕" w:eastAsia="맑은 고딕" w:hAnsi="맑은 고딕" w:hint="eastAsia"/>
-                <w:sz w:val="16"/>
-                <w:szCs w:val="16"/>
-              </w:rPr>
-              <w:t>000점</w:t>
-            </w:r>
           </w:p>
         </w:tc>
         <w:tc>
@@ -2955,12 +2436,6 @@
                 <w:rFonts w:ascii="맑은 고딕" w:eastAsia="맑은 고딕" w:hAnsi="맑은 고딕"/>
               </w:rPr>
             </w:pPr>
-            <w:r>
-              <w:rPr>
-                <w:rFonts w:ascii="맑은 고딕" w:eastAsia="맑은 고딕" w:hAnsi="맑은 고딕"/>
-              </w:rPr>
-              <w:t>OO교육협회</w:t>
-            </w:r>
           </w:p>
         </w:tc>
       </w:tr>
@@ -3262,14 +2737,6 @@
                 <w:szCs w:val="16"/>
               </w:rPr>
             </w:pPr>
-            <w:r>
-              <w:rPr>
-                <w:rFonts w:ascii="맑은 고딕" w:eastAsia="맑은 고딕" w:hAnsi="맑은 고딕" w:hint="eastAsia"/>
-                <w:sz w:val="16"/>
-                <w:szCs w:val="16"/>
-              </w:rPr>
-              <w:t>0000. 00 ~ 0000. 00</w:t>
-            </w:r>
           </w:p>
         </w:tc>
         <w:tc>
@@ -3298,14 +2765,6 @@
                 <w:szCs w:val="16"/>
               </w:rPr>
             </w:pPr>
-            <w:r>
-              <w:rPr>
-                <w:rFonts w:ascii="맑은 고딕" w:eastAsia="맑은 고딕" w:hAnsi="맑은 고딕" w:hint="eastAsia"/>
-                <w:sz w:val="16"/>
-                <w:szCs w:val="16"/>
-              </w:rPr>
-              <w:t>academic  semester</w:t>
-            </w:r>
           </w:p>
         </w:tc>
         <w:tc>
@@ -3327,12 +2786,6 @@
                 <w:rFonts w:ascii="맑은 고딕" w:eastAsia="맑은 고딕" w:hAnsi="맑은 고딕"/>
               </w:rPr>
             </w:pPr>
-            <w:r>
-              <w:rPr>
-                <w:rFonts w:ascii="맑은 고딕" w:eastAsia="맑은 고딕" w:hAnsi="맑은 고딕" w:hint="eastAsia"/>
-              </w:rPr>
-              <w:t>OO university</w:t>
-            </w:r>
           </w:p>
         </w:tc>
       </w:tr>
@@ -3362,14 +2815,6 @@
                 <w:szCs w:val="16"/>
               </w:rPr>
             </w:pPr>
-            <w:r>
-              <w:rPr>
-                <w:rFonts w:ascii="맑은 고딕" w:eastAsia="맑은 고딕" w:hAnsi="맑은 고딕" w:hint="eastAsia"/>
-                <w:sz w:val="16"/>
-                <w:szCs w:val="16"/>
-              </w:rPr>
-              <w:t>0000. 00 ~ 0000. 00</w:t>
-            </w:r>
           </w:p>
         </w:tc>
         <w:tc>
@@ -3398,45 +2843,96 @@
                 <w:szCs w:val="16"/>
               </w:rPr>
             </w:pPr>
-            <w:r>
+          </w:p>
+        </w:tc>
+        <w:tc>
+          <w:tcPr>
+            <w:tcW w:w="3401" w:type="dxa"/>
+            <w:tcBorders>
+              <w:top w:val="dotted" w:sz="2" w:space="0" w:color="auto"/>
+              <w:left w:val="dotted" w:sz="2" w:space="0" w:color="auto"/>
+              <w:bottom w:val="dotted" w:sz="2" w:space="0" w:color="auto"/>
+            </w:tcBorders>
+            <w:vAlign w:val="center"/>
+          </w:tcPr>
+          <w:p>
+            <w:pPr>
+              <w:pStyle w:val="8"/>
+              <w:ind w:right="0"/>
+              <w:jc w:val="center"/>
               <w:rPr>
                 <w:rFonts w:ascii="맑은 고딕" w:eastAsia="맑은 고딕" w:hAnsi="맑은 고딕" w:hint="eastAsia"/>
-                <w:sz w:val="16"/>
-                <w:szCs w:val="16"/>
-              </w:rPr>
-              <w:t>비즈니스 회화</w:t>
-            </w:r>
-          </w:p>
-        </w:tc>
-        <w:tc>
-          <w:tcPr>
-            <w:tcW w:w="3401" w:type="dxa"/>
-            <w:tcBorders>
-              <w:top w:val="dotted" w:sz="2" w:space="0" w:color="auto"/>
-              <w:left w:val="dotted" w:sz="2" w:space="0" w:color="auto"/>
-              <w:bottom w:val="dotted" w:sz="2" w:space="0" w:color="auto"/>
-            </w:tcBorders>
-            <w:vAlign w:val="center"/>
-          </w:tcPr>
-          <w:p>
-            <w:pPr>
-              <w:pStyle w:val="8"/>
-              <w:ind w:right="0"/>
-              <w:jc w:val="center"/>
-              <w:rPr>
-                <w:rFonts w:ascii="맑은 고딕" w:eastAsia="맑은 고딕" w:hAnsi="맑은 고딕" w:hint="eastAsia"/>
-              </w:rPr>
-            </w:pPr>
-            <w:r>
-              <w:rPr>
-                <w:rFonts w:ascii="맑은 고딕" w:eastAsia="맑은 고딕" w:hAnsi="맑은 고딕" w:hint="eastAsia"/>
-              </w:rPr>
-              <w:t>OO 어학원</w:t>
-            </w:r>
+              </w:rPr>
+            </w:pPr>
           </w:p>
         </w:tc>
       </w:tr>
     </w:tbl>
+    <w:p>
+      <w:pPr>
+        <w:pStyle w:val="a9"/>
+        <w:rPr>
+          <w:rStyle w:val="Char3"/>
+          <w:rFonts w:ascii="맑은 고딕" w:eastAsia="맑은 고딕" w:hAnsi="맑은 고딕"/>
+          <w:b/>
+          <w:color w:val="0D0D0D"/>
+          <w:sz w:val="20"/>
+          <w:szCs w:val="18"/>
+        </w:rPr>
+      </w:pPr>
+    </w:p>
+    <w:p>
+      <w:pPr>
+        <w:pStyle w:val="a9"/>
+        <w:rPr>
+          <w:rStyle w:val="Char3"/>
+          <w:rFonts w:ascii="맑은 고딕" w:eastAsia="맑은 고딕" w:hAnsi="맑은 고딕"/>
+          <w:b/>
+          <w:color w:val="0D0D0D"/>
+          <w:sz w:val="20"/>
+          <w:szCs w:val="18"/>
+        </w:rPr>
+      </w:pPr>
+    </w:p>
+    <w:p>
+      <w:pPr>
+        <w:pStyle w:val="a9"/>
+        <w:rPr>
+          <w:rStyle w:val="Char3"/>
+          <w:rFonts w:ascii="맑은 고딕" w:eastAsia="맑은 고딕" w:hAnsi="맑은 고딕"/>
+          <w:b/>
+          <w:color w:val="0D0D0D"/>
+          <w:sz w:val="20"/>
+          <w:szCs w:val="18"/>
+        </w:rPr>
+      </w:pPr>
+    </w:p>
+    <w:p>
+      <w:pPr>
+        <w:pStyle w:val="a9"/>
+        <w:rPr>
+          <w:rStyle w:val="Char3"/>
+          <w:rFonts w:ascii="맑은 고딕" w:eastAsia="맑은 고딕" w:hAnsi="맑은 고딕"/>
+          <w:b/>
+          <w:color w:val="0D0D0D"/>
+          <w:sz w:val="20"/>
+          <w:szCs w:val="18"/>
+        </w:rPr>
+      </w:pPr>
+    </w:p>
+    <w:p>
+      <w:pPr>
+        <w:pStyle w:val="a9"/>
+        <w:rPr>
+          <w:rStyle w:val="Char3"/>
+          <w:rFonts w:ascii="맑은 고딕" w:eastAsia="맑은 고딕" w:hAnsi="맑은 고딕"/>
+          <w:b/>
+          <w:color w:val="0D0D0D"/>
+          <w:sz w:val="20"/>
+          <w:szCs w:val="18"/>
+        </w:rPr>
+      </w:pPr>
+    </w:p>
     <w:p>
       <w:pPr>
         <w:pStyle w:val="a9"/>
@@ -3625,14 +3121,6 @@
                 <w:szCs w:val="16"/>
               </w:rPr>
             </w:pPr>
-            <w:r>
-              <w:rPr>
-                <w:rFonts w:ascii="맑은 고딕" w:eastAsia="맑은 고딕" w:hAnsi="맑은 고딕" w:hint="eastAsia"/>
-                <w:sz w:val="16"/>
-                <w:szCs w:val="16"/>
-              </w:rPr>
-              <w:t>0000. 00 ~ 0000. 00</w:t>
-            </w:r>
           </w:p>
         </w:tc>
         <w:tc>
@@ -3667,7 +3155,7 @@
                 <w:sz w:val="16"/>
                 <w:szCs w:val="16"/>
               </w:rPr>
-              <w:t>세부활동 내용을 작성합니다.</w:t>
+              <w:t>.</w:t>
             </w:r>
           </w:p>
         </w:tc>
@@ -3690,12 +3178,6 @@
                 <w:rFonts w:ascii="맑은 고딕" w:eastAsia="맑은 고딕" w:hAnsi="맑은 고딕"/>
               </w:rPr>
             </w:pPr>
-            <w:r>
-              <w:rPr>
-                <w:rFonts w:ascii="맑은 고딕" w:eastAsia="맑은 고딕" w:hAnsi="맑은 고딕" w:hint="eastAsia"/>
-              </w:rPr>
-              <w:t>OO교육협회</w:t>
-            </w:r>
           </w:p>
         </w:tc>
       </w:tr>
@@ -3725,14 +3207,6 @@
                 <w:szCs w:val="16"/>
               </w:rPr>
             </w:pPr>
-            <w:r>
-              <w:rPr>
-                <w:rFonts w:ascii="맑은 고딕" w:eastAsia="맑은 고딕" w:hAnsi="맑은 고딕" w:hint="eastAsia"/>
-                <w:sz w:val="16"/>
-                <w:szCs w:val="16"/>
-              </w:rPr>
-              <w:t>0000. 00 ~ 0000. 00</w:t>
-            </w:r>
           </w:p>
         </w:tc>
         <w:tc>
@@ -3761,14 +3235,6 @@
                 <w:szCs w:val="16"/>
               </w:rPr>
             </w:pPr>
-            <w:r>
-              <w:rPr>
-                <w:rFonts w:ascii="맑은 고딕" w:eastAsia="맑은 고딕" w:hAnsi="맑은 고딕" w:hint="eastAsia"/>
-                <w:sz w:val="16"/>
-                <w:szCs w:val="16"/>
-              </w:rPr>
-              <w:t>세부활동 내용을 작성합니다.</w:t>
-            </w:r>
           </w:p>
         </w:tc>
         <w:tc>
@@ -3790,12 +3256,6 @@
                 <w:rFonts w:ascii="맑은 고딕" w:eastAsia="맑은 고딕" w:hAnsi="맑은 고딕"/>
               </w:rPr>
             </w:pPr>
-            <w:r>
-              <w:rPr>
-                <w:rFonts w:ascii="맑은 고딕" w:eastAsia="맑은 고딕" w:hAnsi="맑은 고딕" w:hint="eastAsia"/>
-              </w:rPr>
-              <w:t>OO교육협회</w:t>
-            </w:r>
           </w:p>
         </w:tc>
       </w:tr>
@@ -3825,15 +3285,6 @@
                 <w:szCs w:val="16"/>
               </w:rPr>
             </w:pPr>
-            <w:r>
-              <w:rPr>
-                <w:rFonts w:ascii="맑은 고딕" w:eastAsia="맑은 고딕" w:hAnsi="맑은 고딕" w:hint="eastAsia"/>
-                <w:sz w:val="16"/>
-                <w:szCs w:val="16"/>
-              </w:rPr>
-              <w:lastRenderedPageBreak/>
-              <w:t>0000. 00 ~ 0000. 00</w:t>
-            </w:r>
           </w:p>
         </w:tc>
         <w:tc>
@@ -3862,41 +3313,27 @@
                 <w:szCs w:val="16"/>
               </w:rPr>
             </w:pPr>
-            <w:r>
+          </w:p>
+        </w:tc>
+        <w:tc>
+          <w:tcPr>
+            <w:tcW w:w="3684" w:type="dxa"/>
+            <w:tcBorders>
+              <w:top w:val="dotted" w:sz="2" w:space="0" w:color="auto"/>
+              <w:left w:val="dotted" w:sz="2" w:space="0" w:color="auto"/>
+              <w:bottom w:val="dotted" w:sz="2" w:space="0" w:color="auto"/>
+            </w:tcBorders>
+            <w:vAlign w:val="center"/>
+          </w:tcPr>
+          <w:p>
+            <w:pPr>
+              <w:pStyle w:val="8"/>
+              <w:ind w:right="0"/>
+              <w:jc w:val="center"/>
               <w:rPr>
                 <w:rFonts w:ascii="맑은 고딕" w:eastAsia="맑은 고딕" w:hAnsi="맑은 고딕" w:hint="eastAsia"/>
-                <w:sz w:val="16"/>
-                <w:szCs w:val="16"/>
-              </w:rPr>
-              <w:t>세부활동 내용을 작성합니다.</w:t>
-            </w:r>
-          </w:p>
-        </w:tc>
-        <w:tc>
-          <w:tcPr>
-            <w:tcW w:w="3684" w:type="dxa"/>
-            <w:tcBorders>
-              <w:top w:val="dotted" w:sz="2" w:space="0" w:color="auto"/>
-              <w:left w:val="dotted" w:sz="2" w:space="0" w:color="auto"/>
-              <w:bottom w:val="dotted" w:sz="2" w:space="0" w:color="auto"/>
-            </w:tcBorders>
-            <w:vAlign w:val="center"/>
-          </w:tcPr>
-          <w:p>
-            <w:pPr>
-              <w:pStyle w:val="8"/>
-              <w:ind w:right="0"/>
-              <w:jc w:val="center"/>
-              <w:rPr>
-                <w:rFonts w:ascii="맑은 고딕" w:eastAsia="맑은 고딕" w:hAnsi="맑은 고딕" w:hint="eastAsia"/>
-              </w:rPr>
-            </w:pPr>
-            <w:r>
-              <w:rPr>
-                <w:rFonts w:ascii="맑은 고딕" w:eastAsia="맑은 고딕" w:hAnsi="맑은 고딕" w:hint="eastAsia"/>
-              </w:rPr>
-              <w:t>OO교육협회</w:t>
-            </w:r>
+              </w:rPr>
+            </w:pPr>
           </w:p>
         </w:tc>
       </w:tr>
@@ -4092,14 +3529,6 @@
                 <w:szCs w:val="16"/>
               </w:rPr>
             </w:pPr>
-            <w:r>
-              <w:rPr>
-                <w:rFonts w:ascii="맑은 고딕" w:eastAsia="맑은 고딕" w:hAnsi="맑은 고딕" w:hint="eastAsia"/>
-                <w:sz w:val="16"/>
-                <w:szCs w:val="16"/>
-              </w:rPr>
-              <w:t>0000. 00</w:t>
-            </w:r>
           </w:p>
         </w:tc>
         <w:tc>
@@ -4128,14 +3557,6 @@
                 <w:szCs w:val="16"/>
               </w:rPr>
             </w:pPr>
-            <w:r>
-              <w:rPr>
-                <w:rFonts w:ascii="맑은 고딕" w:eastAsia="맑은 고딕" w:hAnsi="맑은 고딕" w:hint="eastAsia"/>
-                <w:sz w:val="16"/>
-                <w:szCs w:val="16"/>
-              </w:rPr>
-              <w:t>수상 내용을 기재합니다.</w:t>
-            </w:r>
           </w:p>
         </w:tc>
         <w:tc>
@@ -4157,12 +3578,6 @@
                 <w:rFonts w:ascii="맑은 고딕" w:eastAsia="맑은 고딕" w:hAnsi="맑은 고딕"/>
               </w:rPr>
             </w:pPr>
-            <w:r>
-              <w:rPr>
-                <w:rFonts w:ascii="맑은 고딕" w:eastAsia="맑은 고딕" w:hAnsi="맑은 고딕" w:hint="eastAsia"/>
-              </w:rPr>
-              <w:t>OO교육협회</w:t>
-            </w:r>
           </w:p>
         </w:tc>
       </w:tr>
@@ -4192,14 +3607,6 @@
                 <w:szCs w:val="16"/>
               </w:rPr>
             </w:pPr>
-            <w:r>
-              <w:rPr>
-                <w:rFonts w:ascii="맑은 고딕" w:eastAsia="맑은 고딕" w:hAnsi="맑은 고딕" w:hint="eastAsia"/>
-                <w:sz w:val="16"/>
-                <w:szCs w:val="16"/>
-              </w:rPr>
-              <w:t>0000. 00</w:t>
-            </w:r>
           </w:p>
         </w:tc>
         <w:tc>
@@ -4228,14 +3635,6 @@
                 <w:szCs w:val="16"/>
               </w:rPr>
             </w:pPr>
-            <w:r>
-              <w:rPr>
-                <w:rFonts w:ascii="맑은 고딕" w:eastAsia="맑은 고딕" w:hAnsi="맑은 고딕" w:hint="eastAsia"/>
-                <w:sz w:val="16"/>
-                <w:szCs w:val="16"/>
-              </w:rPr>
-              <w:t>수상 내용을 기재합니다.</w:t>
-            </w:r>
           </w:p>
         </w:tc>
         <w:tc>
@@ -4257,12 +3656,6 @@
                 <w:rFonts w:ascii="맑은 고딕" w:eastAsia="맑은 고딕" w:hAnsi="맑은 고딕"/>
               </w:rPr>
             </w:pPr>
-            <w:r>
-              <w:rPr>
-                <w:rFonts w:ascii="맑은 고딕" w:eastAsia="맑은 고딕" w:hAnsi="맑은 고딕" w:hint="eastAsia"/>
-              </w:rPr>
-              <w:t>OOO사무국</w:t>
-            </w:r>
           </w:p>
         </w:tc>
       </w:tr>
@@ -4621,14 +4014,6 @@
                 <w:szCs w:val="16"/>
               </w:rPr>
             </w:pPr>
-            <w:r>
-              <w:rPr>
-                <w:rFonts w:ascii="맑은 고딕" w:eastAsia="맑은 고딕" w:hAnsi="맑은 고딕" w:hint="eastAsia"/>
-                <w:sz w:val="16"/>
-                <w:szCs w:val="16"/>
-              </w:rPr>
-              <w:t>0000. 00</w:t>
-            </w:r>
           </w:p>
         </w:tc>
         <w:tc>
@@ -4657,14 +4042,6 @@
                 <w:szCs w:val="16"/>
               </w:rPr>
             </w:pPr>
-            <w:r>
-              <w:rPr>
-                <w:rFonts w:ascii="맑은 고딕" w:eastAsia="맑은 고딕" w:hAnsi="맑은 고딕" w:hint="eastAsia"/>
-                <w:sz w:val="16"/>
-                <w:szCs w:val="16"/>
-              </w:rPr>
-              <w:t>자격증 내용을 기재합니다.</w:t>
-            </w:r>
           </w:p>
         </w:tc>
         <w:tc>
@@ -4689,14 +4066,6 @@
                 <w:szCs w:val="16"/>
               </w:rPr>
             </w:pPr>
-            <w:r>
-              <w:rPr>
-                <w:rFonts w:ascii="맑은 고딕" w:eastAsia="맑은 고딕" w:hAnsi="맑은 고딕" w:hint="eastAsia"/>
-                <w:sz w:val="16"/>
-                <w:szCs w:val="16"/>
-              </w:rPr>
-              <w:t>A</w:t>
-            </w:r>
           </w:p>
         </w:tc>
         <w:tc>
@@ -4723,12 +4092,6 @@
                 <w:rFonts w:ascii="맑은 고딕" w:eastAsia="맑은 고딕" w:hAnsi="맑은 고딕"/>
               </w:rPr>
             </w:pPr>
-            <w:r>
-              <w:rPr>
-                <w:rFonts w:ascii="맑은 고딕" w:eastAsia="맑은 고딕" w:hAnsi="맑은 고딕" w:hint="eastAsia"/>
-              </w:rPr>
-              <w:t>OO교육협회</w:t>
-            </w:r>
           </w:p>
         </w:tc>
         <w:tc>
@@ -4783,14 +4146,6 @@
                 <w:szCs w:val="16"/>
               </w:rPr>
             </w:pPr>
-            <w:r>
-              <w:rPr>
-                <w:rFonts w:ascii="맑은 고딕" w:eastAsia="맑은 고딕" w:hAnsi="맑은 고딕" w:hint="eastAsia"/>
-                <w:sz w:val="16"/>
-                <w:szCs w:val="16"/>
-              </w:rPr>
-              <w:t>0000. 00</w:t>
-            </w:r>
           </w:p>
         </w:tc>
         <w:tc>
@@ -4819,14 +4174,6 @@
                 <w:szCs w:val="16"/>
               </w:rPr>
             </w:pPr>
-            <w:r>
-              <w:rPr>
-                <w:rFonts w:ascii="맑은 고딕" w:eastAsia="맑은 고딕" w:hAnsi="맑은 고딕" w:hint="eastAsia"/>
-                <w:sz w:val="16"/>
-                <w:szCs w:val="16"/>
-              </w:rPr>
-              <w:t>자격증 내용을 기재합니다.</w:t>
-            </w:r>
           </w:p>
         </w:tc>
         <w:tc>
@@ -4851,14 +4198,6 @@
                 <w:szCs w:val="16"/>
               </w:rPr>
             </w:pPr>
-            <w:r>
-              <w:rPr>
-                <w:rFonts w:ascii="맑은 고딕" w:eastAsia="맑은 고딕" w:hAnsi="맑은 고딕" w:hint="eastAsia"/>
-                <w:sz w:val="16"/>
-                <w:szCs w:val="16"/>
-              </w:rPr>
-              <w:t>C</w:t>
-            </w:r>
           </w:p>
         </w:tc>
         <w:tc>
@@ -4885,12 +4224,6 @@
                 <w:rFonts w:ascii="맑은 고딕" w:eastAsia="맑은 고딕" w:hAnsi="맑은 고딕"/>
               </w:rPr>
             </w:pPr>
-            <w:r>
-              <w:rPr>
-                <w:rFonts w:ascii="맑은 고딕" w:eastAsia="맑은 고딕" w:hAnsi="맑은 고딕" w:hint="eastAsia"/>
-              </w:rPr>
-              <w:t>OO교육협회</w:t>
-            </w:r>
           </w:p>
         </w:tc>
         <w:tc>
@@ -5248,14 +4581,6 @@
                 <w:szCs w:val="16"/>
               </w:rPr>
             </w:pPr>
-            <w:r>
-              <w:rPr>
-                <w:rFonts w:ascii="맑은 고딕" w:eastAsia="맑은 고딕" w:hAnsi="맑은 고딕" w:hint="eastAsia"/>
-                <w:sz w:val="16"/>
-                <w:szCs w:val="16"/>
-              </w:rPr>
-              <w:t>0000. 00 ~ 0000. 00</w:t>
-            </w:r>
           </w:p>
         </w:tc>
         <w:tc>
@@ -5284,14 +4609,6 @@
                 <w:szCs w:val="16"/>
               </w:rPr>
             </w:pPr>
-            <w:r>
-              <w:rPr>
-                <w:rFonts w:ascii="맑은 고딕" w:eastAsia="맑은 고딕" w:hAnsi="맑은 고딕" w:hint="eastAsia"/>
-                <w:sz w:val="16"/>
-                <w:szCs w:val="16"/>
-              </w:rPr>
-              <w:t>병장</w:t>
-            </w:r>
           </w:p>
         </w:tc>
         <w:tc>
@@ -5530,14 +4847,6 @@
                 <w:szCs w:val="16"/>
               </w:rPr>
             </w:pPr>
-            <w:r>
-              <w:rPr>
-                <w:rFonts w:ascii="맑은 고딕" w:eastAsia="맑은 고딕" w:hAnsi="맑은 고딕" w:hint="eastAsia"/>
-                <w:sz w:val="16"/>
-                <w:szCs w:val="16"/>
-              </w:rPr>
-              <w:t>웹표준 (드림위버 포함)</w:t>
-            </w:r>
           </w:p>
         </w:tc>
         <w:tc>
@@ -5566,14 +4875,6 @@
                 <w:szCs w:val="16"/>
               </w:rPr>
             </w:pPr>
-            <w:r>
-              <w:rPr>
-                <w:rFonts w:ascii="맑은 고딕" w:eastAsia="맑은 고딕" w:hAnsi="맑은 고딕" w:hint="eastAsia"/>
-                <w:sz w:val="16"/>
-                <w:szCs w:val="16"/>
-              </w:rPr>
-              <w:t>상</w:t>
-            </w:r>
           </w:p>
         </w:tc>
         <w:tc>
@@ -5599,12 +4900,6 @@
                 <w:rFonts w:ascii="맑은 고딕" w:eastAsia="맑은 고딕" w:hAnsi="맑은 고딕"/>
               </w:rPr>
             </w:pPr>
-            <w:r>
-              <w:rPr>
-                <w:rFonts w:ascii="맑은 고딕" w:eastAsia="맑은 고딕" w:hAnsi="맑은 고딕" w:hint="eastAsia"/>
-              </w:rPr>
-              <w:t>OO교육협회 자격증</w:t>
-            </w:r>
           </w:p>
         </w:tc>
       </w:tr>
@@ -5634,14 +4929,6 @@
                 <w:szCs w:val="16"/>
               </w:rPr>
             </w:pPr>
-            <w:r>
-              <w:rPr>
-                <w:rFonts w:ascii="맑은 고딕" w:eastAsia="맑은 고딕" w:hAnsi="맑은 고딕" w:hint="eastAsia"/>
-                <w:sz w:val="16"/>
-                <w:szCs w:val="16"/>
-              </w:rPr>
-              <w:t>파워포인트</w:t>
-            </w:r>
           </w:p>
         </w:tc>
         <w:tc>
@@ -5670,14 +4957,6 @@
                 <w:szCs w:val="16"/>
               </w:rPr>
             </w:pPr>
-            <w:r>
-              <w:rPr>
-                <w:rFonts w:ascii="맑은 고딕" w:eastAsia="맑은 고딕" w:hAnsi="맑은 고딕" w:hint="eastAsia"/>
-                <w:sz w:val="16"/>
-                <w:szCs w:val="16"/>
-              </w:rPr>
-              <w:t>상</w:t>
-            </w:r>
           </w:p>
         </w:tc>
         <w:tc>
@@ -5703,12 +4982,6 @@
                 <w:rFonts w:ascii="맑은 고딕" w:eastAsia="맑은 고딕" w:hAnsi="맑은 고딕"/>
               </w:rPr>
             </w:pPr>
-            <w:r>
-              <w:rPr>
-                <w:rFonts w:ascii="맑은 고딕" w:eastAsia="맑은 고딕" w:hAnsi="맑은 고딕" w:hint="eastAsia"/>
-              </w:rPr>
-              <w:t>OO교육협회 자격증</w:t>
-            </w:r>
           </w:p>
         </w:tc>
       </w:tr>
@@ -5738,14 +5011,6 @@
                 <w:szCs w:val="16"/>
               </w:rPr>
             </w:pPr>
-            <w:r>
-              <w:rPr>
-                <w:rFonts w:ascii="맑은 고딕" w:eastAsia="맑은 고딕" w:hAnsi="맑은 고딕" w:hint="eastAsia"/>
-                <w:sz w:val="16"/>
-                <w:szCs w:val="16"/>
-              </w:rPr>
-              <w:t>워드, 한글, 엑셀</w:t>
-            </w:r>
           </w:p>
         </w:tc>
         <w:tc>
@@ -5774,14 +5039,6 @@
                 <w:szCs w:val="16"/>
               </w:rPr>
             </w:pPr>
-            <w:r>
-              <w:rPr>
-                <w:rFonts w:ascii="맑은 고딕" w:eastAsia="맑은 고딕" w:hAnsi="맑은 고딕" w:hint="eastAsia"/>
-                <w:sz w:val="16"/>
-                <w:szCs w:val="16"/>
-              </w:rPr>
-              <w:t>중</w:t>
-            </w:r>
           </w:p>
         </w:tc>
         <w:tc>
@@ -5807,18 +5064,6 @@
                 <w:rFonts w:ascii="맑은 고딕" w:eastAsia="맑은 고딕" w:hAnsi="맑은 고딕"/>
               </w:rPr>
             </w:pPr>
-            <w:r>
-              <w:rPr>
-                <w:rFonts w:ascii="맑은 고딕" w:eastAsia="맑은 고딕" w:hAnsi="맑은 고딕" w:hint="eastAsia"/>
-              </w:rPr>
-              <w:t xml:space="preserve">OO교육협회 </w:t>
-            </w:r>
-            <w:r>
-              <w:rPr>
-                <w:rFonts w:ascii="맑은 고딕" w:eastAsia="맑은 고딕" w:hAnsi="맑은 고딕" w:hint="eastAsia"/>
-              </w:rPr>
-              <w:t>자격증</w:t>
-            </w:r>
           </w:p>
         </w:tc>
       </w:tr>
@@ -5950,6 +5195,7 @@
           <w:sz w:val="20"/>
           <w:szCs w:val="18"/>
         </w:rPr>
+        <w:lastRenderedPageBreak/>
         <w:t>수행 프로젝트</w:t>
       </w:r>
     </w:p>
@@ -6334,14 +5580,6 @@
                 <w:szCs w:val="16"/>
               </w:rPr>
             </w:pPr>
-            <w:r>
-              <w:rPr>
-                <w:rFonts w:hint="eastAsia"/>
-                <w:sz w:val="16"/>
-                <w:szCs w:val="16"/>
-              </w:rPr>
-              <w:t>내용을 기재합니다.</w:t>
-            </w:r>
           </w:p>
         </w:tc>
         <w:tc>
@@ -6429,7 +5667,6 @@
               <w:right w:w="105" w:type="dxa"/>
             </w:tcMar>
             <w:vAlign w:val="center"/>
-            <w:hideMark/>
           </w:tcPr>
           <w:p>
             <w:pPr>
@@ -6446,21 +5683,6 @@
                 <w:szCs w:val="16"/>
               </w:rPr>
             </w:pPr>
-            <w:r>
-              <w:rPr>
-                <w:sz w:val="16"/>
-                <w:szCs w:val="16"/>
-              </w:rPr>
-              <w:t>﻿</w:t>
-            </w:r>
-            <w:r>
-              <w:rPr>
-                <w:rFonts w:hint="eastAsia"/>
-                <w:sz w:val="16"/>
-                <w:szCs w:val="16"/>
-              </w:rPr>
-              <w:t>0000. 00 ~ 0000. 00</w:t>
-            </w:r>
           </w:p>
         </w:tc>
       </w:tr>
@@ -6553,14 +5775,6 @@
                 <w:szCs w:val="16"/>
               </w:rPr>
             </w:pPr>
-            <w:r>
-              <w:rPr>
-                <w:rFonts w:hint="eastAsia"/>
-                <w:sz w:val="16"/>
-                <w:szCs w:val="16"/>
-              </w:rPr>
-              <w:t>내용을 기재합니다.</w:t>
-            </w:r>
           </w:p>
         </w:tc>
       </w:tr>
@@ -6653,14 +5867,6 @@
                 <w:szCs w:val="16"/>
               </w:rPr>
             </w:pPr>
-            <w:r>
-              <w:rPr>
-                <w:rFonts w:hint="eastAsia"/>
-                <w:sz w:val="16"/>
-                <w:szCs w:val="16"/>
-              </w:rPr>
-              <w:t>내용을 기재합니다.</w:t>
-            </w:r>
           </w:p>
         </w:tc>
       </w:tr>
@@ -6713,7 +5919,6 @@
                 <w:sz w:val="16"/>
                 <w:szCs w:val="16"/>
               </w:rPr>
-              <w:lastRenderedPageBreak/>
               <w:t>주요업무</w:t>
             </w:r>
             <w:r>
@@ -6746,7 +5951,6 @@
               <w:right w:w="105" w:type="dxa"/>
             </w:tcMar>
             <w:vAlign w:val="center"/>
-            <w:hideMark/>
           </w:tcPr>
           <w:p>
             <w:pPr>
@@ -6760,14 +5964,6 @@
                 <w:szCs w:val="16"/>
               </w:rPr>
             </w:pPr>
-            <w:r>
-              <w:rPr>
-                <w:rFonts w:hint="eastAsia"/>
-                <w:sz w:val="16"/>
-                <w:szCs w:val="16"/>
-              </w:rPr>
-              <w:t>내용을 기재합니다.</w:t>
-            </w:r>
           </w:p>
         </w:tc>
         <w:tc>
@@ -6879,14 +6075,6 @@
               </w:rPr>
               <w:t>﻿﻿</w:t>
             </w:r>
-            <w:r>
-              <w:rPr>
-                <w:rFonts w:hint="eastAsia"/>
-                <w:sz w:val="16"/>
-                <w:szCs w:val="16"/>
-              </w:rPr>
-              <w:t>0000. 00 ~ 0000. 00</w:t>
-            </w:r>
           </w:p>
         </w:tc>
       </w:tr>
@@ -6959,7 +6147,6 @@
               <w:right w:w="105" w:type="dxa"/>
             </w:tcMar>
             <w:vAlign w:val="center"/>
-            <w:hideMark/>
           </w:tcPr>
           <w:p>
             <w:pPr>
@@ -6973,14 +6160,6 @@
                 <w:szCs w:val="16"/>
               </w:rPr>
             </w:pPr>
-            <w:r>
-              <w:rPr>
-                <w:rFonts w:hint="eastAsia"/>
-                <w:sz w:val="16"/>
-                <w:szCs w:val="16"/>
-              </w:rPr>
-              <w:t>내용을 기재합니다.</w:t>
-            </w:r>
           </w:p>
         </w:tc>
       </w:tr>
@@ -7067,28 +6246,6 @@
             </w:tcMar>
             <w:hideMark/>
           </w:tcPr>
-          <w:p>
-            <w:pPr>
-              <w:widowControl/>
-              <w:wordWrap/>
-              <w:autoSpaceDE/>
-              <w:autoSpaceDN/>
-              <w:jc w:val="left"/>
-              <w:rPr>
-                <w:rFonts w:hint="eastAsia"/>
-                <w:sz w:val="16"/>
-                <w:szCs w:val="16"/>
-              </w:rPr>
-            </w:pPr>
-            <w:r>
-              <w:rPr>
-                <w:rFonts w:hint="eastAsia"/>
-                <w:sz w:val="16"/>
-                <w:szCs w:val="16"/>
-              </w:rPr>
-              <w:t>내용을 기재합니다.</w:t>
-            </w:r>
-          </w:p>
           <w:p>
             <w:pPr>
               <w:widowControl/>
@@ -7533,7 +6690,6 @@
               <w:right w:w="105" w:type="dxa"/>
             </w:tcMar>
             <w:vAlign w:val="center"/>
-            <w:hideMark/>
           </w:tcPr>
           <w:p>
             <w:pPr>
@@ -7547,14 +6703,6 @@
                 <w:szCs w:val="16"/>
               </w:rPr>
             </w:pPr>
-            <w:r>
-              <w:rPr>
-                <w:rFonts w:hint="eastAsia"/>
-                <w:sz w:val="16"/>
-                <w:szCs w:val="16"/>
-              </w:rPr>
-              <w:t>내용을 기재합니다.</w:t>
-            </w:r>
           </w:p>
         </w:tc>
         <w:tc>
@@ -7642,7 +6790,6 @@
               <w:right w:w="105" w:type="dxa"/>
             </w:tcMar>
             <w:vAlign w:val="center"/>
-            <w:hideMark/>
           </w:tcPr>
           <w:p>
             <w:pPr>
@@ -7659,22 +6806,6 @@
                 <w:szCs w:val="16"/>
               </w:rPr>
             </w:pPr>
-            <w:r>
-              <w:rPr>
-                <w:rFonts w:ascii="Courier New" w:hAnsi="Courier New" w:cs="Courier New"/>
-                <w:sz w:val="16"/>
-                <w:szCs w:val="16"/>
-              </w:rPr>
-              <w:t>﻿﻿</w:t>
-            </w:r>
-            <w:r>
-              <w:rPr>
-                <w:rFonts w:hint="eastAsia"/>
-                <w:sz w:val="16"/>
-                <w:szCs w:val="16"/>
-              </w:rPr>
-              <w:t>0000. 00 ~ 0000. 00</w:t>
-            </w:r>
           </w:p>
         </w:tc>
       </w:tr>
@@ -7748,7 +6879,6 @@
               <w:right w:w="105" w:type="dxa"/>
             </w:tcMar>
             <w:vAlign w:val="center"/>
-            <w:hideMark/>
           </w:tcPr>
           <w:p>
             <w:pPr>
@@ -7762,14 +6892,6 @@
                 <w:szCs w:val="16"/>
               </w:rPr>
             </w:pPr>
-            <w:r>
-              <w:rPr>
-                <w:rFonts w:hint="eastAsia"/>
-                <w:sz w:val="16"/>
-                <w:szCs w:val="16"/>
-              </w:rPr>
-              <w:t>내용을 기재합니다.</w:t>
-            </w:r>
           </w:p>
         </w:tc>
       </w:tr>
@@ -7843,86 +6965,7 @@
               <w:bottom w:w="0" w:type="dxa"/>
               <w:right w:w="0" w:type="dxa"/>
             </w:tcMar>
-            <w:hideMark/>
-          </w:tcPr>
-          <w:p>
-            <w:pPr>
-              <w:widowControl/>
-              <w:wordWrap/>
-              <w:autoSpaceDE/>
-              <w:autoSpaceDN/>
-              <w:jc w:val="left"/>
-              <w:rPr>
-                <w:rFonts w:hint="eastAsia"/>
-                <w:sz w:val="16"/>
-                <w:szCs w:val="16"/>
-              </w:rPr>
-            </w:pPr>
-            <w:r>
-              <w:rPr>
-                <w:rFonts w:hint="eastAsia"/>
-                <w:sz w:val="16"/>
-                <w:szCs w:val="16"/>
-              </w:rPr>
-              <w:t>내용을 기재합니다.</w:t>
-            </w:r>
-          </w:p>
-          <w:p>
-            <w:pPr>
-              <w:widowControl/>
-              <w:wordWrap/>
-              <w:autoSpaceDE/>
-              <w:autoSpaceDN/>
-              <w:jc w:val="left"/>
-              <w:rPr>
-                <w:rFonts w:hint="eastAsia"/>
-                <w:sz w:val="16"/>
-                <w:szCs w:val="16"/>
-              </w:rPr>
-            </w:pPr>
-          </w:p>
-          <w:p>
-            <w:pPr>
-              <w:widowControl/>
-              <w:wordWrap/>
-              <w:autoSpaceDE/>
-              <w:autoSpaceDN/>
-              <w:jc w:val="left"/>
-              <w:rPr>
-                <w:rFonts w:hint="eastAsia"/>
-                <w:sz w:val="16"/>
-                <w:szCs w:val="16"/>
-              </w:rPr>
-            </w:pPr>
-          </w:p>
-          <w:p>
-            <w:pPr>
-              <w:widowControl/>
-              <w:wordWrap/>
-              <w:autoSpaceDE/>
-              <w:autoSpaceDN/>
-              <w:jc w:val="left"/>
-              <w:rPr>
-                <w:rFonts w:hint="eastAsia"/>
-                <w:sz w:val="16"/>
-                <w:szCs w:val="16"/>
-              </w:rPr>
-            </w:pPr>
-          </w:p>
-          <w:p>
-            <w:pPr>
-              <w:widowControl/>
-              <w:wordWrap/>
-              <w:autoSpaceDE/>
-              <w:autoSpaceDN/>
-              <w:jc w:val="left"/>
-              <w:rPr>
-                <w:rFonts w:hint="eastAsia"/>
-                <w:sz w:val="16"/>
-                <w:szCs w:val="16"/>
-              </w:rPr>
-            </w:pPr>
-          </w:p>
+          </w:tcPr>
           <w:p>
             <w:pPr>
               <w:widowControl/>
@@ -8019,7 +7062,6 @@
               <w:right w:w="105" w:type="dxa"/>
             </w:tcMar>
             <w:vAlign w:val="center"/>
-            <w:hideMark/>
           </w:tcPr>
           <w:p>
             <w:pPr>
@@ -8033,14 +7075,6 @@
                 <w:szCs w:val="16"/>
               </w:rPr>
             </w:pPr>
-            <w:r>
-              <w:rPr>
-                <w:rFonts w:hint="eastAsia"/>
-                <w:sz w:val="16"/>
-                <w:szCs w:val="16"/>
-              </w:rPr>
-              <w:t>내용을 기재합니다.</w:t>
-            </w:r>
           </w:p>
         </w:tc>
         <w:tc>
@@ -8153,14 +7187,6 @@
               </w:rPr>
               <w:t>﻿﻿</w:t>
             </w:r>
-            <w:r>
-              <w:rPr>
-                <w:rFonts w:hint="eastAsia"/>
-                <w:sz w:val="16"/>
-                <w:szCs w:val="16"/>
-              </w:rPr>
-              <w:t>0000. 00 ~ 0000. 00</w:t>
-            </w:r>
           </w:p>
         </w:tc>
       </w:tr>
@@ -8247,14 +7273,6 @@
                 <w:szCs w:val="16"/>
               </w:rPr>
             </w:pPr>
-            <w:r>
-              <w:rPr>
-                <w:rFonts w:hint="eastAsia"/>
-                <w:sz w:val="16"/>
-                <w:szCs w:val="16"/>
-              </w:rPr>
-              <w:t>내용을 기재합니다.</w:t>
-            </w:r>
           </w:p>
         </w:tc>
       </w:tr>
@@ -8341,28 +7359,6 @@
             </w:tcMar>
             <w:hideMark/>
           </w:tcPr>
-          <w:p>
-            <w:pPr>
-              <w:widowControl/>
-              <w:wordWrap/>
-              <w:autoSpaceDE/>
-              <w:autoSpaceDN/>
-              <w:jc w:val="left"/>
-              <w:rPr>
-                <w:rFonts w:hint="eastAsia"/>
-                <w:sz w:val="16"/>
-                <w:szCs w:val="16"/>
-              </w:rPr>
-            </w:pPr>
-            <w:r>
-              <w:rPr>
-                <w:rFonts w:hint="eastAsia"/>
-                <w:sz w:val="16"/>
-                <w:szCs w:val="16"/>
-              </w:rPr>
-              <w:t>내용을 기재합니다.</w:t>
-            </w:r>
-          </w:p>
           <w:p>
             <w:pPr>
               <w:widowControl/>
@@ -8692,21 +7688,6 @@
           </w:tcPr>
           <w:p>
             <w:pPr>
-              <w:rPr>
-                <w:rFonts w:hint="eastAsia"/>
-                <w:sz w:val="16"/>
-              </w:rPr>
-            </w:pPr>
-            <w:r>
-              <w:rPr>
-                <w:rFonts w:hint="eastAsia"/>
-                <w:sz w:val="16"/>
-              </w:rPr>
-              <w:t>내용을 기재합니다.</w:t>
-            </w:r>
-          </w:p>
-          <w:p>
-            <w:pPr>
               <w:pStyle w:val="aa"/>
               <w:ind w:right="0" w:hanging="1"/>
               <w:jc w:val="left"/>
@@ -8805,7 +7786,6 @@
               <w:rPr>
                 <w:rFonts w:ascii="맑은 고딕" w:eastAsia="맑은 고딕" w:hAnsi="맑은 고딕" w:hint="eastAsia"/>
               </w:rPr>
-              <w:lastRenderedPageBreak/>
               <w:t>학창시절</w:t>
             </w:r>
             <w:r>
@@ -8842,13 +7822,6 @@
                 <w:sz w:val="16"/>
               </w:rPr>
             </w:pPr>
-            <w:r>
-              <w:rPr>
-                <w:rFonts w:hint="eastAsia"/>
-                <w:sz w:val="16"/>
-              </w:rPr>
-              <w:t>내용을 기재합니다.</w:t>
-            </w:r>
           </w:p>
           <w:p>
             <w:pPr>
@@ -8979,21 +7952,6 @@
               <w:right w:w="0" w:type="dxa"/>
             </w:tcMar>
           </w:tcPr>
-          <w:p>
-            <w:pPr>
-              <w:rPr>
-                <w:rFonts w:hint="eastAsia"/>
-                <w:sz w:val="16"/>
-              </w:rPr>
-            </w:pPr>
-            <w:r>
-              <w:rPr>
-                <w:rFonts w:hint="eastAsia"/>
-                <w:sz w:val="16"/>
-              </w:rPr>
-              <w:t>내용을 기재합니다.</w:t>
-            </w:r>
-          </w:p>
           <w:p>
             <w:pPr>
               <w:pStyle w:val="aa"/>
@@ -9198,22 +8156,6 @@
       </w:pPr>
       <w:r>
         <w:rPr>
-          <w:rFonts w:ascii="맑은 고딕" w:eastAsia="맑은 고딕" w:hAnsi="맑은 고딕"/>
-          <w:b w:val="0"/>
-          <w:sz w:val="20"/>
-        </w:rPr>
-        <w:t>201</w:t>
-      </w:r>
-      <w:r>
-        <w:rPr>
-          <w:rFonts w:ascii="맑은 고딕" w:eastAsia="맑은 고딕" w:hAnsi="맑은 고딕" w:hint="eastAsia"/>
-          <w:b w:val="0"/>
-          <w:sz w:val="20"/>
-        </w:rPr>
-        <w:t>6</w:t>
-      </w:r>
-      <w:r>
-        <w:rPr>
           <w:rFonts w:ascii="맑은 고딕" w:eastAsia="맑은 고딕" w:hAnsi="맑은 고딕" w:hint="eastAsia"/>
           <w:b w:val="0"/>
           <w:sz w:val="20"/>
@@ -9226,23 +8168,7 @@
           <w:b w:val="0"/>
           <w:sz w:val="20"/>
         </w:rPr>
-        <w:t xml:space="preserve">  </w:t>
-      </w:r>
-      <w:r>
-        <w:rPr>
-          <w:rFonts w:ascii="맑은 고딕" w:eastAsia="맑은 고딕" w:hAnsi="맑은 고딕" w:hint="eastAsia"/>
-          <w:b w:val="0"/>
-          <w:sz w:val="20"/>
-        </w:rPr>
-        <w:t>04</w:t>
-      </w:r>
-      <w:r>
-        <w:rPr>
-          <w:rFonts w:ascii="맑은 고딕" w:eastAsia="맑은 고딕" w:hAnsi="맑은 고딕"/>
-          <w:b w:val="0"/>
-          <w:sz w:val="20"/>
-        </w:rPr>
-        <w:t xml:space="preserve"> </w:t>
+        <w:t xml:space="preserve">   </w:t>
       </w:r>
       <w:r>
         <w:rPr>
@@ -9266,15 +8192,7 @@
           <w:b w:val="0"/>
           <w:sz w:val="20"/>
         </w:rPr>
-        <w:t>01</w:t>
-      </w:r>
-      <w:r>
-        <w:rPr>
-          <w:rFonts w:ascii="맑은 고딕" w:eastAsia="맑은 고딕" w:hAnsi="맑은 고딕"/>
-          <w:b w:val="0"/>
-          <w:sz w:val="20"/>
-        </w:rPr>
-        <w:t xml:space="preserve"> </w:t>
+        <w:t xml:space="preserve">  </w:t>
       </w:r>
       <w:r>
         <w:rPr>
@@ -9343,23 +8261,7 @@
           <w:sz w:val="20"/>
           <w:szCs w:val="18"/>
         </w:rPr>
-        <w:t xml:space="preserve">   O O O</w:t>
-      </w:r>
-      <w:r>
-        <w:rPr>
-          <w:rFonts w:ascii="맑은 고딕" w:eastAsia="맑은 고딕" w:hAnsi="맑은 고딕"/>
-          <w:sz w:val="20"/>
-          <w:szCs w:val="18"/>
-        </w:rPr>
-        <w:t xml:space="preserve"> </w:t>
-      </w:r>
-      <w:r>
-        <w:rPr>
-          <w:rFonts w:ascii="맑은 고딕" w:eastAsia="맑은 고딕" w:hAnsi="맑은 고딕" w:hint="eastAsia"/>
-          <w:sz w:val="20"/>
-          <w:szCs w:val="18"/>
-        </w:rPr>
-        <w:t xml:space="preserve"> </w:t>
+        <w:t xml:space="preserve">         </w:t>
       </w:r>
       <w:r>
         <w:rPr>
@@ -9387,7 +8289,7 @@
       </w:r>
     </w:p>
     <w:sectPr>
-      <w:headerReference w:type="first" r:id="rId10"/>
+      <w:headerReference w:type="first" r:id="rId8"/>
       <w:type w:val="nextColumn"/>
       <w:pgSz w:w="11906" w:h="16838" w:code="9"/>
       <w:pgMar w:top="1985" w:right="1134" w:bottom="1134" w:left="1134" w:header="850" w:footer="284" w:gutter="0"/>
@@ -10083,46 +8985,46 @@
       </w:rPr>
     </w:lvl>
   </w:abstractNum>
-  <w:num w:numId="1" w16cid:durableId="348290348">
+  <w:num w:numId="1" w16cid:durableId="870999960">
     <w:abstractNumId w:val="13"/>
   </w:num>
-  <w:num w:numId="2" w16cid:durableId="1290864694">
+  <w:num w:numId="2" w16cid:durableId="2088727876">
     <w:abstractNumId w:val="9"/>
   </w:num>
-  <w:num w:numId="3" w16cid:durableId="498808925">
+  <w:num w:numId="3" w16cid:durableId="1964384096">
     <w:abstractNumId w:val="7"/>
   </w:num>
-  <w:num w:numId="4" w16cid:durableId="257566313">
+  <w:num w:numId="4" w16cid:durableId="1553888125">
     <w:abstractNumId w:val="6"/>
   </w:num>
-  <w:num w:numId="5" w16cid:durableId="1300040438">
+  <w:num w:numId="5" w16cid:durableId="1585534741">
     <w:abstractNumId w:val="5"/>
   </w:num>
-  <w:num w:numId="6" w16cid:durableId="552084522">
+  <w:num w:numId="6" w16cid:durableId="280764125">
     <w:abstractNumId w:val="4"/>
   </w:num>
-  <w:num w:numId="7" w16cid:durableId="356587027">
+  <w:num w:numId="7" w16cid:durableId="1285890380">
     <w:abstractNumId w:val="8"/>
   </w:num>
-  <w:num w:numId="8" w16cid:durableId="275257096">
+  <w:num w:numId="8" w16cid:durableId="406539711">
     <w:abstractNumId w:val="3"/>
   </w:num>
-  <w:num w:numId="9" w16cid:durableId="1253129577">
+  <w:num w:numId="9" w16cid:durableId="1488208189">
     <w:abstractNumId w:val="2"/>
   </w:num>
-  <w:num w:numId="10" w16cid:durableId="762727785">
+  <w:num w:numId="10" w16cid:durableId="2105029130">
     <w:abstractNumId w:val="1"/>
   </w:num>
-  <w:num w:numId="11" w16cid:durableId="158349435">
+  <w:num w:numId="11" w16cid:durableId="1536114447">
     <w:abstractNumId w:val="0"/>
   </w:num>
-  <w:num w:numId="12" w16cid:durableId="1989896587">
+  <w:num w:numId="12" w16cid:durableId="1950044639">
     <w:abstractNumId w:val="10"/>
   </w:num>
-  <w:num w:numId="13" w16cid:durableId="1185828645">
+  <w:num w:numId="13" w16cid:durableId="278875208">
     <w:abstractNumId w:val="11"/>
   </w:num>
-  <w:num w:numId="14" w16cid:durableId="1919510921">
+  <w:num w:numId="14" w16cid:durableId="599607613">
     <w:abstractNumId w:val="12"/>
   </w:num>
 </w:numbering>

</xml_diff>